<commit_message>
Final Polish: Fix Table 1 and Figure 4 paragraph splitting
</commit_message>
<xml_diff>
--- a/pdf-docx/submission_work/SecureMark-Med_Final.docx
+++ b/pdf-docx/submission_work/SecureMark-Med_Final.docx
@@ -306,13 +306,12 @@
         <w:tblCaption w:val="Architectural comparison of medical image security schemes."/>
       </w:tblPr>
       <w:tblGrid>
-        <w:gridCol w:w="1131"/>
-        <w:gridCol w:w="1131"/>
-        <w:gridCol w:w="1131"/>
-        <w:gridCol w:w="1131"/>
-        <w:gridCol w:w="1131"/>
-        <w:gridCol w:w="1131"/>
-        <w:gridCol w:w="1131"/>
+        <w:gridCol w:w="1320"/>
+        <w:gridCol w:w="1320"/>
+        <w:gridCol w:w="1320"/>
+        <w:gridCol w:w="1320"/>
+        <w:gridCol w:w="1320"/>
+        <w:gridCol w:w="1320"/>
       </w:tblGrid>
       <w:tr>
         <w:trPr>
@@ -326,10 +325,6 @@
               <w:jc w:val="left"/>
             </w:pPr>
             <w:r>
-              <w:rPr>
-                <w:b/>
-                <w:bCs/>
-              </w:rPr>
               <w:t xml:space="preserve">Scheme</w:t>
             </w:r>
           </w:p>
@@ -339,13 +334,9 @@
           <w:p>
             <w:pPr>
               <w:pStyle w:val="Compact"/>
-              <w:jc w:val="left"/>
-            </w:pPr>
-            <w:r>
-              <w:rPr>
-                <w:b/>
-                <w:bCs/>
-              </w:rPr>
+              <w:jc w:val="center"/>
+            </w:pPr>
+            <w:r>
               <w:t xml:space="preserve">WM</w:t>
             </w:r>
           </w:p>
@@ -358,10 +349,6 @@
               <w:jc w:val="center"/>
             </w:pPr>
             <w:r>
-              <w:rPr>
-                <w:b/>
-                <w:bCs/>
-              </w:rPr>
               <w:t xml:space="preserve">Encryption</w:t>
             </w:r>
           </w:p>
@@ -374,10 +361,6 @@
               <w:jc w:val="center"/>
             </w:pPr>
             <w:r>
-              <w:rPr>
-                <w:b/>
-                <w:bCs/>
-              </w:rPr>
               <w:t xml:space="preserve">Integrity</w:t>
             </w:r>
           </w:p>
@@ -390,10 +373,6 @@
               <w:jc w:val="center"/>
             </w:pPr>
             <w:r>
-              <w:rPr>
-                <w:b/>
-                <w:bCs/>
-              </w:rPr>
               <w:t xml:space="preserve">Edge-Ready</w:t>
             </w:r>
           </w:p>
@@ -406,20 +385,8 @@
               <w:jc w:val="center"/>
             </w:pPr>
             <w:r>
-              <w:rPr>
-                <w:b/>
-                <w:bCs/>
-              </w:rPr>
               <w:t xml:space="preserve">Freshness Check</w:t>
             </w:r>
-          </w:p>
-        </w:tc>
-        <w:tc>
-          <w:tcPr/>
-          <w:p>
-            <w:pPr>
-              <w:pStyle w:val="Compact"/>
-            </w:pPr>
           </w:p>
         </w:tc>
       </w:tr>
@@ -432,28 +399,16 @@
               <w:jc w:val="left"/>
             </w:pPr>
             <w:r>
-              <w:t xml:space="preserve">Memon &amp; Alzahrani</w:t>
-            </w:r>
-            <w:r>
-              <w:t xml:space="preserve"> </w:t>
-            </w:r>
-            <w:r>
-              <w:t xml:space="preserve">[</w:t>
-            </w:r>
-            <w:r>
-              <w:t xml:space="preserve">1</w:t>
-            </w:r>
-            <w:r>
-              <w:t xml:space="preserve">]</w:t>
-            </w:r>
-          </w:p>
-        </w:tc>
-        <w:tc>
-          <w:tcPr/>
-          <w:p>
-            <w:pPr>
-              <w:pStyle w:val="Compact"/>
-              <w:jc w:val="left"/>
+              <w:t xml:space="preserve">Memon and Alzahrani [1]</w:t>
+            </w:r>
+          </w:p>
+        </w:tc>
+        <w:tc>
+          <w:tcPr/>
+          <w:p>
+            <w:pPr>
+              <w:pStyle w:val="Compact"/>
+              <w:jc w:val="center"/>
             </w:pPr>
             <m:oMath>
               <m:r>
@@ -516,14 +471,6 @@
             </w:r>
           </w:p>
         </w:tc>
-        <w:tc>
-          <w:tcPr/>
-          <w:p>
-            <w:pPr>
-              <w:pStyle w:val="Compact"/>
-            </w:pPr>
-          </w:p>
-        </w:tc>
       </w:tr>
       <w:tr>
         <w:tc>
@@ -534,28 +481,16 @@
               <w:jc w:val="left"/>
             </w:pPr>
             <w:r>
-              <w:t xml:space="preserve">Anand &amp; Singh</w:t>
-            </w:r>
-            <w:r>
-              <w:t xml:space="preserve"> </w:t>
-            </w:r>
-            <w:r>
-              <w:t xml:space="preserve">[</w:t>
-            </w:r>
-            <w:r>
-              <w:t xml:space="preserve">2</w:t>
-            </w:r>
-            <w:r>
-              <w:t xml:space="preserve">]</w:t>
-            </w:r>
-          </w:p>
-        </w:tc>
-        <w:tc>
-          <w:tcPr/>
-          <w:p>
-            <w:pPr>
-              <w:pStyle w:val="Compact"/>
-              <w:jc w:val="left"/>
+              <w:t xml:space="preserve">Anand and Singh [2]</w:t>
+            </w:r>
+          </w:p>
+        </w:tc>
+        <w:tc>
+          <w:tcPr/>
+          <w:p>
+            <w:pPr>
+              <w:pStyle w:val="Compact"/>
+              <w:jc w:val="center"/>
             </w:pPr>
             <m:oMath>
               <m:r>
@@ -618,14 +553,6 @@
             </w:r>
           </w:p>
         </w:tc>
-        <w:tc>
-          <w:tcPr/>
-          <w:p>
-            <w:pPr>
-              <w:pStyle w:val="Compact"/>
-            </w:pPr>
-          </w:p>
-        </w:tc>
       </w:tr>
       <w:tr>
         <w:tc>
@@ -636,28 +563,16 @@
               <w:jc w:val="left"/>
             </w:pPr>
             <w:r>
-              <w:t xml:space="preserve">Gull et al.</w:t>
-            </w:r>
-            <w:r>
-              <w:t xml:space="preserve"> </w:t>
-            </w:r>
-            <w:r>
-              <w:t xml:space="preserve">[</w:t>
-            </w:r>
-            <w:r>
-              <w:t xml:space="preserve">4</w:t>
-            </w:r>
-            <w:r>
-              <w:t xml:space="preserve">]</w:t>
-            </w:r>
-          </w:p>
-        </w:tc>
-        <w:tc>
-          <w:tcPr/>
-          <w:p>
-            <w:pPr>
-              <w:pStyle w:val="Compact"/>
-              <w:jc w:val="left"/>
+              <w:t xml:space="preserve">Gull et al. [4]</w:t>
+            </w:r>
+          </w:p>
+        </w:tc>
+        <w:tc>
+          <w:tcPr/>
+          <w:p>
+            <w:pPr>
+              <w:pStyle w:val="Compact"/>
+              <w:jc w:val="center"/>
             </w:pPr>
             <m:oMath>
               <m:r>
@@ -720,14 +635,6 @@
             </w:r>
           </w:p>
         </w:tc>
-        <w:tc>
-          <w:tcPr/>
-          <w:p>
-            <w:pPr>
-              <w:pStyle w:val="Compact"/>
-            </w:pPr>
-          </w:p>
-        </w:tc>
       </w:tr>
       <w:tr>
         <w:tc>
@@ -738,28 +645,16 @@
               <w:jc w:val="left"/>
             </w:pPr>
             <w:r>
-              <w:t xml:space="preserve">Singh et al.</w:t>
-            </w:r>
-            <w:r>
-              <w:t xml:space="preserve"> </w:t>
-            </w:r>
-            <w:r>
-              <w:t xml:space="preserve">[</w:t>
-            </w:r>
-            <w:r>
-              <w:t xml:space="preserve">5</w:t>
-            </w:r>
-            <w:r>
-              <w:t xml:space="preserve">]</w:t>
-            </w:r>
-          </w:p>
-        </w:tc>
-        <w:tc>
-          <w:tcPr/>
-          <w:p>
-            <w:pPr>
-              <w:pStyle w:val="Compact"/>
-              <w:jc w:val="left"/>
+              <w:t xml:space="preserve">Singh et al. [5]</w:t>
+            </w:r>
+          </w:p>
+        </w:tc>
+        <w:tc>
+          <w:tcPr/>
+          <w:p>
+            <w:pPr>
+              <w:pStyle w:val="Compact"/>
+              <w:jc w:val="center"/>
             </w:pPr>
             <m:oMath>
               <m:r>
@@ -828,14 +723,6 @@
             <w:r>
               <w:t xml:space="preserve">—</w:t>
             </w:r>
-          </w:p>
-        </w:tc>
-        <w:tc>
-          <w:tcPr/>
-          <w:p>
-            <w:pPr>
-              <w:pStyle w:val="Compact"/>
-            </w:pPr>
           </w:p>
         </w:tc>
       </w:tr>
@@ -861,7 +748,7 @@
           <w:p>
             <w:pPr>
               <w:pStyle w:val="Compact"/>
-              <w:jc w:val="left"/>
+              <w:jc w:val="center"/>
             </w:pPr>
             <m:oMath>
               <m:r>
@@ -871,9 +758,6 @@
                 <m:t>✓</m:t>
               </m:r>
             </m:oMath>
-            <w:r>
-              <w:t xml:space="preserve">​</w:t>
-            </w:r>
           </w:p>
         </w:tc>
         <w:tc>
@@ -923,9 +807,6 @@
                 <m:t>✓</m:t>
               </m:r>
             </m:oMath>
-            <w:r>
-              <w:t xml:space="preserve">​</w:t>
-            </w:r>
           </w:p>
         </w:tc>
         <w:tc>
@@ -943,17 +824,6 @@
                 <m:t>✓</m:t>
               </m:r>
             </m:oMath>
-            <w:r>
-              <w:t xml:space="preserve">​</w:t>
-            </w:r>
-          </w:p>
-        </w:tc>
-        <w:tc>
-          <w:tcPr/>
-          <w:p>
-            <w:pPr>
-              <w:pStyle w:val="Compact"/>
-            </w:pPr>
           </w:p>
         </w:tc>
       </w:tr>
@@ -3760,7 +3630,7 @@
       <w:r>
         <w:drawing>
           <wp:inline>
-            <wp:extent cx="4907280" cy="1633450"/>
+            <wp:extent cx="4533900" cy="1509166"/>
             <wp:effectExtent b="0" l="0" r="0" t="0"/>
             <wp:docPr descr="" title="" id="21" name="Picture"/>
             <a:graphic>
@@ -3781,7 +3651,7 @@
                   <pic:spPr bwMode="auto">
                     <a:xfrm>
                       <a:off x="0" y="0"/>
-                      <a:ext cx="4907280" cy="1633450"/>
+                      <a:ext cx="4533900" cy="1509166"/>
                     </a:xfrm>
                     <a:prstGeom prst="rect">
                       <a:avLst/>
@@ -4126,6 +3996,80 @@
         </m:oMath>
       </m:oMathPara>
     </w:p>
+    <w:p>
+      <w:pPr>
+        <w:pStyle w:val="FirstParagraph"/>
+      </w:pPr>
+      <w:r>
+        <w:t xml:space="preserve">As documented in Table </w:t>
+      </w:r>
+      <w:hyperlink w:anchor="tab:dataset_fidelity">
+        <w:r>
+          <w:rPr>
+            <w:rStyle w:val="Hyperlink"/>
+          </w:rPr>
+          <w:t xml:space="preserve">2</w:t>
+        </w:r>
+      </w:hyperlink>
+      <w:r>
+        <w:t xml:space="preserve">, watermark embedding preserved high structural fidelity (</w:t>
+      </w:r>
+      <m:oMath>
+        <m:r>
+          <m:rPr>
+            <m:nor/>
+            <m:sty m:val="p"/>
+          </m:rPr>
+          <m:t>PSNR</m:t>
+        </m:r>
+        <m:r>
+          <m:rPr>
+            <m:sty m:val="p"/>
+          </m:rPr>
+          <m:t>&gt;</m:t>
+        </m:r>
+        <m:r>
+          <m:t>51.4</m:t>
+        </m:r>
+        <m:r>
+          <m:t> </m:t>
+        </m:r>
+        <m:r>
+          <m:rPr>
+            <m:nor/>
+            <m:sty m:val="p"/>
+          </m:rPr>
+          <m:t>dB</m:t>
+        </m:r>
+      </m:oMath>
+      <w:r>
+        <w:t xml:space="preserve">,</w:t>
+      </w:r>
+      <w:r>
+        <w:t xml:space="preserve"> </w:t>
+      </w:r>
+      <m:oMath>
+        <m:r>
+          <m:rPr>
+            <m:nor/>
+            <m:sty m:val="p"/>
+          </m:rPr>
+          <m:t>SSIM</m:t>
+        </m:r>
+        <m:r>
+          <m:rPr>
+            <m:sty m:val="p"/>
+          </m:rPr>
+          <m:t>&gt;</m:t>
+        </m:r>
+        <m:r>
+          <m:t>0.999</m:t>
+        </m:r>
+      </m:oMath>
+      <w:r>
+        <w:t xml:space="preserve">) on full-scale clinical matrices, consistent with theoretical MSE boundaries.</w:t>
+      </w:r>
+    </w:p>
     <w:bookmarkStart w:id="28" w:name="fig:visual_fidelity"/>
     <w:p>
       <w:pPr>
@@ -4134,7 +4078,7 @@
       <w:r>
         <w:drawing>
           <wp:inline>
-            <wp:extent cx="2400300" cy="871446"/>
+            <wp:extent cx="4533900" cy="1615883"/>
             <wp:effectExtent b="0" l="0" r="0" t="0"/>
             <wp:docPr descr="" title="" id="26" name="Picture"/>
             <a:graphic>
@@ -4155,7 +4099,7 @@
                   <pic:spPr bwMode="auto">
                     <a:xfrm>
                       <a:off x="0" y="0"/>
-                      <a:ext cx="2400300" cy="871446"/>
+                      <a:ext cx="4533900" cy="1615883"/>
                     </a:xfrm>
                     <a:prstGeom prst="rect">
                       <a:avLst/>
@@ -4179,14 +4123,14 @@
         <w:pStyle w:val="ImageCaption"/>
       </w:pPr>
       <w:r>
-        <w:t xml:space="preserve">Visual fidelity comparison on a separate, illustrative</w:t>
+        <w:t xml:space="preserve">Visual fidelity comparison on a high-resolution</w:t>
       </w:r>
       <w:r>
         <w:t xml:space="preserve"> </w:t>
       </w:r>
       <m:oMath>
         <m:r>
-          <m:t>128</m:t>
+          <m:t>1024</m:t>
         </m:r>
         <m:r>
           <m:rPr>
@@ -4195,14 +4139,14 @@
           <m:t>×</m:t>
         </m:r>
         <m:r>
-          <m:t>128</m:t>
+          <m:t>1024</m:t>
         </m:r>
       </m:oMath>
       <w:r>
         <w:t xml:space="preserve"> </w:t>
       </w:r>
       <w:r>
-        <w:t xml:space="preserve">sample demonstrating (a) original matrix, (b) watermarked slice with embedded provenance, and (c) an amplified difference residual map (</w:t>
+        <w:t xml:space="preserve">clinical Chest X-Ray sample demonstrating (a) original matrix, (b) watermarked slice with embedded provenance, and (c) an amplified difference residual map (</w:t>
       </w:r>
       <m:oMath>
         <m:r>
@@ -4255,14 +4199,14 @@
         </m:r>
       </m:oMath>
       <w:r>
-        <w:t xml:space="preserve">). Note that the localized</w:t>
+        <w:t xml:space="preserve">). Note that the</w:t>
       </w:r>
       <w:r>
         <w:t xml:space="preserve"> </w:t>
       </w:r>
       <m:oMath>
         <m:r>
-          <m:t>88.17</m:t>
+          <m:t>52.14</m:t>
         </m:r>
         <m:r>
           <m:t> </m:t>
@@ -4279,30 +4223,7 @@
         <w:t xml:space="preserve"> </w:t>
       </w:r>
       <w:r>
-        <w:t xml:space="preserve">PSNR shown here differs from the full-scale</w:t>
-      </w:r>
-      <w:r>
-        <w:t xml:space="preserve"> </w:t>
-      </w:r>
-      <m:oMath>
-        <m:r>
-          <m:t>512</m:t>
-        </m:r>
-        <m:r>
-          <m:rPr>
-            <m:sty m:val="p"/>
-          </m:rPr>
-          <m:t>×</m:t>
-        </m:r>
-        <m:r>
-          <m:t>512</m:t>
-        </m:r>
-      </m:oMath>
-      <w:r>
-        <w:t xml:space="preserve"> </w:t>
-      </w:r>
-      <w:r>
-        <w:t xml:space="preserve">dataset evaluations in Table </w:t>
+        <w:t xml:space="preserve">PSNR shown here matches the full-scale dataset evaluations in Table </w:t>
       </w:r>
       <w:hyperlink w:anchor="tab:dataset_fidelity">
         <w:r>
@@ -4317,80 +4238,6 @@
       </w:r>
     </w:p>
     <w:bookmarkEnd w:id="28"/>
-    <w:p>
-      <w:pPr>
-        <w:pStyle w:val="BodyText"/>
-      </w:pPr>
-      <w:r>
-        <w:t xml:space="preserve">As documented in Table </w:t>
-      </w:r>
-      <w:hyperlink w:anchor="tab:dataset_fidelity">
-        <w:r>
-          <w:rPr>
-            <w:rStyle w:val="Hyperlink"/>
-          </w:rPr>
-          <w:t xml:space="preserve">2</w:t>
-        </w:r>
-      </w:hyperlink>
-      <w:r>
-        <w:t xml:space="preserve">, watermark embedding preserved high structural fidelity (</w:t>
-      </w:r>
-      <m:oMath>
-        <m:r>
-          <m:rPr>
-            <m:nor/>
-            <m:sty m:val="p"/>
-          </m:rPr>
-          <m:t>PSNR</m:t>
-        </m:r>
-        <m:r>
-          <m:rPr>
-            <m:sty m:val="p"/>
-          </m:rPr>
-          <m:t>&gt;</m:t>
-        </m:r>
-        <m:r>
-          <m:t>51.4</m:t>
-        </m:r>
-        <m:r>
-          <m:t> </m:t>
-        </m:r>
-        <m:r>
-          <m:rPr>
-            <m:nor/>
-            <m:sty m:val="p"/>
-          </m:rPr>
-          <m:t>dB</m:t>
-        </m:r>
-      </m:oMath>
-      <w:r>
-        <w:t xml:space="preserve">,</w:t>
-      </w:r>
-      <w:r>
-        <w:t xml:space="preserve"> </w:t>
-      </w:r>
-      <m:oMath>
-        <m:r>
-          <m:rPr>
-            <m:nor/>
-            <m:sty m:val="p"/>
-          </m:rPr>
-          <m:t>SSIM</m:t>
-        </m:r>
-        <m:r>
-          <m:rPr>
-            <m:sty m:val="p"/>
-          </m:rPr>
-          <m:t>&gt;</m:t>
-        </m:r>
-        <m:r>
-          <m:t>0.999</m:t>
-        </m:r>
-      </m:oMath>
-      <w:r>
-        <w:t xml:space="preserve">) on full-scale clinical matrices, consistent with theoretical MSE boundaries.</w:t>
-      </w:r>
-    </w:p>
     <w:bookmarkEnd w:id="29"/>
     <w:bookmarkStart w:id="34" w:name="X74af997bb59ba9fcb49c12645731b3bf5d3b628"/>
     <w:p>
@@ -4465,7 +4312,7 @@
       <w:r>
         <w:drawing>
           <wp:inline>
-            <wp:extent cx="4907280" cy="1633450"/>
+            <wp:extent cx="4533900" cy="1509166"/>
             <wp:effectExtent b="0" l="0" r="0" t="0"/>
             <wp:docPr descr="" title="" id="31" name="Picture"/>
             <a:graphic>
@@ -4486,7 +4333,7 @@
                   <pic:spPr bwMode="auto">
                     <a:xfrm>
                       <a:off x="0" y="0"/>
-                      <a:ext cx="4907280" cy="1633450"/>
+                      <a:ext cx="4533900" cy="1509166"/>
                     </a:xfrm>
                     <a:prstGeom prst="rect">
                       <a:avLst/>

</xml_diff>